<commit_message>
docs: regenerate 0.6.9 guides with Homebrew install
</commit_message>
<xml_diff>
--- a/DisplayHelp-0.6.9-User-Guide.docx
+++ b/DisplayHelp-0.6.9-User-Guide.docx
@@ -357,6 +357,117 @@
     <w:p>
       <w:pPr>
         <w:pStyle w:val="FirstParagraph"/>
+      </w:pPr>
+      <w:r>
+        <w:t xml:space="preserve">Install DisplayHelp from the signed installer package your helpdesk provides, or from a terminal with Homebrew:</w:t>
+      </w:r>
+    </w:p>
+    <w:p>
+      <w:pPr>
+        <w:pStyle w:val="SourceCode"/>
+      </w:pPr>
+      <w:r>
+        <w:rPr>
+          <w:rStyle w:val="ExtensionTok"/>
+        </w:rPr>
+        <w:t xml:space="preserve">brew</w:t>
+      </w:r>
+      <w:r>
+        <w:rPr>
+          <w:rStyle w:val="NormalTok"/>
+        </w:rPr>
+        <w:t xml:space="preserve"> tap hov172/signaro</w:t>
+      </w:r>
+      <w:r>
+        <w:br/>
+      </w:r>
+      <w:r>
+        <w:rPr>
+          <w:rStyle w:val="ExtensionTok"/>
+        </w:rPr>
+        <w:t xml:space="preserve">brew</w:t>
+      </w:r>
+      <w:r>
+        <w:rPr>
+          <w:rStyle w:val="NormalTok"/>
+        </w:rPr>
+        <w:t xml:space="preserve"> trust hov172/signaro   </w:t>
+      </w:r>
+      <w:r>
+        <w:rPr>
+          <w:rStyle w:val="CommentTok"/>
+        </w:rPr>
+        <w:t xml:space="preserve"># Homebrew 5+ refuses third-party taps until you trust them</w:t>
+      </w:r>
+      <w:r>
+        <w:br/>
+      </w:r>
+      <w:r>
+        <w:rPr>
+          <w:rStyle w:val="ExtensionTok"/>
+        </w:rPr>
+        <w:t xml:space="preserve">brew</w:t>
+      </w:r>
+      <w:r>
+        <w:rPr>
+          <w:rStyle w:val="NormalTok"/>
+        </w:rPr>
+        <w:t xml:space="preserve"> install </w:t>
+      </w:r>
+      <w:r>
+        <w:rPr>
+          <w:rStyle w:val="AttributeTok"/>
+        </w:rPr>
+        <w:t xml:space="preserve">--cask</w:t>
+      </w:r>
+      <w:r>
+        <w:rPr>
+          <w:rStyle w:val="NormalTok"/>
+        </w:rPr>
+        <w:t xml:space="preserve"> displayhelp</w:t>
+      </w:r>
+    </w:p>
+    <w:p>
+      <w:pPr>
+        <w:pStyle w:val="FirstParagraph"/>
+      </w:pPr>
+      <w:r>
+        <w:t xml:space="preserve">Both paths run the same package, so the app lands in Applications and starts at login either way. With Homebrew,</w:t>
+      </w:r>
+      <w:r>
+        <w:t xml:space="preserve"> </w:t>
+      </w:r>
+      <w:r>
+        <w:rPr>
+          <w:rStyle w:val="VerbatimChar"/>
+        </w:rPr>
+        <w:t xml:space="preserve">brew upgrade --cask displayhelp</w:t>
+      </w:r>
+      <w:r>
+        <w:t xml:space="preserve"> </w:t>
+      </w:r>
+      <w:r>
+        <w:t xml:space="preserve">updates it and</w:t>
+      </w:r>
+      <w:r>
+        <w:t xml:space="preserve"> </w:t>
+      </w:r>
+      <w:r>
+        <w:rPr>
+          <w:rStyle w:val="VerbatimChar"/>
+        </w:rPr>
+        <w:t xml:space="preserve">brew uninstall --cask displayhelp</w:t>
+      </w:r>
+      <w:r>
+        <w:t xml:space="preserve"> </w:t>
+      </w:r>
+      <w:r>
+        <w:t xml:space="preserve">removes it with the login agent.</w:t>
+      </w:r>
+    </w:p>
+    <w:p>
+      <w:pPr>
+        <w:pStyle w:val="BodyText"/>
       </w:pPr>
       <w:r>
         <w:t xml:space="preserve">Since 0.6.6, the menu fits its content up to 900 points tall, limited by the available screen height. Scroll inside it for any controls below the visible area.</w:t>

</xml_diff>